<commit_message>
adding work for day 3
</commit_message>
<xml_diff>
--- a/Week2Day2/Week2Day2.docx
+++ b/Week2Day2/Week2Day2.docx
@@ -2,6 +2,577 @@
 <file path=word/document.xml><?xml version="1.0" encoding="utf-8"?>
 <w:document xmlns:wpc="http://schemas.microsoft.com/office/word/2010/wordprocessingCanvas" xmlns:cx="http://schemas.microsoft.com/office/drawing/2014/chartex" xmlns:cx1="http://schemas.microsoft.com/office/drawing/2015/9/8/chartex" xmlns:cx2="http://schemas.microsoft.com/office/drawing/2015/10/21/chartex" xmlns:cx3="http://schemas.microsoft.com/office/drawing/2016/5/9/chartex" xmlns:cx4="http://schemas.microsoft.com/office/drawing/2016/5/10/chartex" xmlns:cx5="http://schemas.microsoft.com/office/drawing/2016/5/11/chartex" xmlns:cx6="http://schemas.microsoft.com/office/drawing/2016/5/12/chartex" xmlns:cx7="http://schemas.microsoft.com/office/drawing/2016/5/13/chartex" xmlns:cx8="http://schemas.microsoft.com/office/drawing/2016/5/14/chartex" xmlns:mc="http://schemas.openxmlformats.org/markup-compatibility/2006" xmlns:aink="http://schemas.microsoft.com/office/drawing/2016/ink" xmlns:am3d="http://schemas.microsoft.com/office/drawing/2017/model3d" xmlns:o="urn:schemas-microsoft-com:office:office" xmlns:oel="http://schemas.microsoft.com/office/2019/extlst" xmlns:r="http://schemas.openxmlformats.org/officeDocument/2006/relationships" xmlns:m="http://schemas.openxmlformats.org/officeDocument/2006/math" xmlns:v="urn:schemas-microsoft-com:vml" xmlns:wp14="http://schemas.microsoft.com/office/word/2010/wordprocessingDrawing" xmlns:wp="http://schemas.openxmlformats.org/drawingml/2006/wordprocessingDrawing" xmlns:w10="urn:schemas-microsoft-com:office:word" xmlns:w="http://schemas.openxmlformats.org/wordprocessingml/2006/main" xmlns:w14="http://schemas.microsoft.com/office/word/2010/wordml" xmlns:w15="http://schemas.microsoft.com/office/word/2012/wordml" xmlns:w16cex="http://schemas.microsoft.com/office/word/2018/wordml/cex" xmlns:w16cid="http://schemas.microsoft.com/office/word/2016/wordml/cid" xmlns:w16="http://schemas.microsoft.com/office/word/2018/wordml" xmlns:w16du="http://schemas.microsoft.com/office/word/2023/wordml/word16du" xmlns:w16sdtdh="http://schemas.microsoft.com/office/word/2020/wordml/sdtdatahash" xmlns:w16sdtfl="http://schemas.microsoft.com/office/word/2024/wordml/sdtformatlock" xmlns:w16se="http://schemas.microsoft.com/office/word/2015/wordml/symex" xmlns:wpg="http://schemas.microsoft.com/office/word/2010/wordprocessingGroup" xmlns:wpi="http://schemas.microsoft.com/office/word/2010/wordprocessingInk" xmlns:wne="http://schemas.microsoft.com/office/word/2006/wordml" xmlns:wps="http://schemas.microsoft.com/office/word/2010/wordprocessingShape" mc:Ignorable="w14 w15 w16se w16cid w16 w16cex w16sdtdh w16sdtfl w16du wp14">
   <w:body>
+    <w:p>
+      <w:pPr>
+        <w:tabs>
+          <w:tab w:val="num" w:pos="720"/>
+        </w:tabs>
+        <w:ind w:left="720" w:hanging="360"/>
+        <w:rPr>
+          <w:b/>
+          <w:bCs/>
+        </w:rPr>
+      </w:pPr>
+      <w:r>
+        <w:rPr>
+          <w:b/>
+          <w:bCs/>
+        </w:rPr>
+        <w:t>ERROR A</w:t>
+      </w:r>
+    </w:p>
+    <w:p>
+      <w:pPr>
+        <w:numPr>
+          <w:ilvl w:val="0"/>
+          <w:numId w:val="2"/>
+        </w:numPr>
+      </w:pPr>
+      <w:r>
+        <w:t>What TYPE of error is it?</w:t>
+      </w:r>
+      <w:r>
+        <w:t xml:space="preserve"> </w:t>
+      </w:r>
+    </w:p>
+    <w:p>
+      <w:pPr>
+        <w:ind w:left="720"/>
+      </w:pPr>
+      <w:r>
+        <w:t>Reference Error</w:t>
+      </w:r>
+    </w:p>
+    <w:p>
+      <w:pPr>
+        <w:numPr>
+          <w:ilvl w:val="0"/>
+          <w:numId w:val="2"/>
+        </w:numPr>
+      </w:pPr>
+      <w:r>
+        <w:t>What does the message mean in plain English?</w:t>
+      </w:r>
+    </w:p>
+    <w:p>
+      <w:pPr>
+        <w:ind w:left="720"/>
+      </w:pPr>
+      <w:r>
+        <w:t>Usually that there is a grammatical error, so maybe a var name was spelled wrong</w:t>
+      </w:r>
+    </w:p>
+    <w:p>
+      <w:pPr>
+        <w:numPr>
+          <w:ilvl w:val="0"/>
+          <w:numId w:val="2"/>
+        </w:numPr>
+      </w:pPr>
+      <w:r>
+        <w:t>What line is the error on?</w:t>
+      </w:r>
+    </w:p>
+    <w:p>
+      <w:pPr>
+        <w:ind w:left="720"/>
+      </w:pPr>
+      <w:r>
+        <w:t xml:space="preserve">Second line </w:t>
+      </w:r>
+    </w:p>
+    <w:p>
+      <w:pPr>
+        <w:numPr>
+          <w:ilvl w:val="0"/>
+          <w:numId w:val="2"/>
+        </w:numPr>
+      </w:pPr>
+      <w:r>
+        <w:t>How would you fix it?</w:t>
+      </w:r>
+    </w:p>
+    <w:p>
+      <w:pPr>
+        <w:numPr>
+          <w:ilvl w:val="0"/>
+          <w:numId w:val="2"/>
+        </w:numPr>
+      </w:pPr>
+      <w:r>
+        <w:t>Correct the spelling of username to userName</w:t>
+      </w:r>
+    </w:p>
+    <w:p/>
+    <w:p>
+      <w:pPr>
+        <w:tabs>
+          <w:tab w:val="num" w:pos="720"/>
+        </w:tabs>
+        <w:ind w:left="720" w:hanging="360"/>
+        <w:rPr>
+          <w:b/>
+          <w:bCs/>
+        </w:rPr>
+      </w:pPr>
+      <w:r>
+        <w:rPr>
+          <w:b/>
+          <w:bCs/>
+        </w:rPr>
+        <w:t xml:space="preserve">ERROR </w:t>
+      </w:r>
+      <w:r>
+        <w:rPr>
+          <w:b/>
+          <w:bCs/>
+        </w:rPr>
+        <w:t>B</w:t>
+      </w:r>
+    </w:p>
+    <w:p>
+      <w:pPr>
+        <w:rPr>
+          <w:b/>
+          <w:bCs/>
+        </w:rPr>
+      </w:pPr>
+    </w:p>
+    <w:p>
+      <w:pPr>
+        <w:numPr>
+          <w:ilvl w:val="0"/>
+          <w:numId w:val="3"/>
+        </w:numPr>
+      </w:pPr>
+      <w:r>
+        <w:t>What TYPE of error is it?</w:t>
+      </w:r>
+    </w:p>
+    <w:p>
+      <w:pPr>
+        <w:ind w:left="720"/>
+      </w:pPr>
+      <w:r>
+        <w:t>Type error</w:t>
+      </w:r>
+    </w:p>
+    <w:p>
+      <w:pPr>
+        <w:numPr>
+          <w:ilvl w:val="0"/>
+          <w:numId w:val="3"/>
+        </w:numPr>
+      </w:pPr>
+      <w:r>
+        <w:t>What does the message mean in plain English?</w:t>
+      </w:r>
+    </w:p>
+    <w:p>
+      <w:pPr>
+        <w:ind w:left="720"/>
+      </w:pPr>
+      <w:r>
+        <w:t xml:space="preserve">The thing that it is trying to read is giving a value of undefined so maybe it doesn’t have that property. </w:t>
+      </w:r>
+    </w:p>
+    <w:p>
+      <w:pPr>
+        <w:numPr>
+          <w:ilvl w:val="0"/>
+          <w:numId w:val="3"/>
+        </w:numPr>
+      </w:pPr>
+      <w:r>
+        <w:t>What line is the error on?</w:t>
+      </w:r>
+    </w:p>
+    <w:p>
+      <w:pPr>
+        <w:ind w:left="720"/>
+      </w:pPr>
+      <w:r>
+        <w:t>The first line</w:t>
+      </w:r>
+    </w:p>
+    <w:p>
+      <w:pPr>
+        <w:numPr>
+          <w:ilvl w:val="0"/>
+          <w:numId w:val="3"/>
+        </w:numPr>
+      </w:pPr>
+      <w:r>
+        <w:t>How would you fix it?</w:t>
+      </w:r>
+    </w:p>
+    <w:p>
+      <w:pPr>
+        <w:ind w:left="720"/>
+      </w:pPr>
+      <w:r>
+        <w:t>Assign some sort of value to fruits. Right now, its probably reading null because there hasn’t been a value assigned</w:t>
+      </w:r>
+    </w:p>
+    <w:p>
+      <w:pPr>
+        <w:rPr>
+          <w:b/>
+          <w:bCs/>
+        </w:rPr>
+      </w:pPr>
+    </w:p>
+    <w:p>
+      <w:pPr>
+        <w:tabs>
+          <w:tab w:val="num" w:pos="720"/>
+        </w:tabs>
+        <w:ind w:left="720" w:hanging="360"/>
+        <w:rPr>
+          <w:b/>
+          <w:bCs/>
+        </w:rPr>
+      </w:pPr>
+      <w:r>
+        <w:rPr>
+          <w:b/>
+          <w:bCs/>
+        </w:rPr>
+        <w:t xml:space="preserve">ERROR </w:t>
+      </w:r>
+      <w:r>
+        <w:rPr>
+          <w:b/>
+          <w:bCs/>
+        </w:rPr>
+        <w:t>C</w:t>
+      </w:r>
+    </w:p>
+    <w:p/>
+    <w:p>
+      <w:pPr>
+        <w:numPr>
+          <w:ilvl w:val="0"/>
+          <w:numId w:val="4"/>
+        </w:numPr>
+      </w:pPr>
+      <w:r>
+        <w:t>What TYPE of error is it?</w:t>
+      </w:r>
+    </w:p>
+    <w:p>
+      <w:pPr>
+        <w:ind w:left="360"/>
+      </w:pPr>
+      <w:r>
+        <w:t>Syntax error</w:t>
+      </w:r>
+    </w:p>
+    <w:p>
+      <w:pPr>
+        <w:numPr>
+          <w:ilvl w:val="0"/>
+          <w:numId w:val="4"/>
+        </w:numPr>
+      </w:pPr>
+      <w:r>
+        <w:lastRenderedPageBreak/>
+        <w:t>What does the message mean in plain English?</w:t>
+      </w:r>
+    </w:p>
+    <w:p>
+      <w:pPr>
+        <w:ind w:left="720"/>
+      </w:pPr>
+      <w:r>
+        <w:t>This usually mean that the code is missing something, like a bracket or semicolon, or quote</w:t>
+      </w:r>
+    </w:p>
+    <w:p>
+      <w:pPr>
+        <w:numPr>
+          <w:ilvl w:val="0"/>
+          <w:numId w:val="4"/>
+        </w:numPr>
+      </w:pPr>
+      <w:r>
+        <w:t>What line is the error on?</w:t>
+      </w:r>
+    </w:p>
+    <w:p>
+      <w:pPr>
+        <w:ind w:left="720"/>
+      </w:pPr>
+      <w:r>
+        <w:t xml:space="preserve">Line 3 or 4, it has one too  many curly braces </w:t>
+      </w:r>
+    </w:p>
+    <w:p>
+      <w:pPr>
+        <w:numPr>
+          <w:ilvl w:val="0"/>
+          <w:numId w:val="4"/>
+        </w:numPr>
+      </w:pPr>
+      <w:r>
+        <w:t>How would you fix it?</w:t>
+      </w:r>
+    </w:p>
+    <w:p>
+      <w:pPr>
+        <w:ind w:left="720"/>
+      </w:pPr>
+      <w:r>
+        <w:t>Remove the extra curly brace</w:t>
+      </w:r>
+    </w:p>
+    <w:p/>
+    <w:p>
+      <w:pPr>
+        <w:tabs>
+          <w:tab w:val="num" w:pos="720"/>
+        </w:tabs>
+        <w:ind w:left="720" w:hanging="360"/>
+        <w:rPr>
+          <w:b/>
+          <w:bCs/>
+        </w:rPr>
+      </w:pPr>
+      <w:r>
+        <w:rPr>
+          <w:b/>
+          <w:bCs/>
+        </w:rPr>
+        <w:t xml:space="preserve">ERROR </w:t>
+      </w:r>
+      <w:r>
+        <w:rPr>
+          <w:b/>
+          <w:bCs/>
+        </w:rPr>
+        <w:t>D</w:t>
+      </w:r>
+    </w:p>
+    <w:p/>
+    <w:p>
+      <w:pPr>
+        <w:numPr>
+          <w:ilvl w:val="0"/>
+          <w:numId w:val="5"/>
+        </w:numPr>
+      </w:pPr>
+      <w:r>
+        <w:t>What TYPE of error is it?</w:t>
+      </w:r>
+    </w:p>
+    <w:p>
+      <w:pPr>
+        <w:ind w:left="720"/>
+      </w:pPr>
+      <w:r>
+        <w:t>Type error</w:t>
+      </w:r>
+    </w:p>
+    <w:p>
+      <w:pPr>
+        <w:numPr>
+          <w:ilvl w:val="0"/>
+          <w:numId w:val="5"/>
+        </w:numPr>
+      </w:pPr>
+      <w:r>
+        <w:t>What does the message mean in plain English?</w:t>
+      </w:r>
+    </w:p>
+    <w:p>
+      <w:pPr>
+        <w:ind w:left="720"/>
+      </w:pPr>
+      <w:r>
+        <w:t xml:space="preserve">This </w:t>
+      </w:r>
+      <w:r>
+        <w:t xml:space="preserve">is </w:t>
+      </w:r>
+      <w:r>
+        <w:t>saying</w:t>
+      </w:r>
+      <w:r>
+        <w:t xml:space="preserve"> the specified code is not a function on the document object. Its not recognizing it. Which tells me there is a spelling error</w:t>
+      </w:r>
+      <w:r>
+        <w:t xml:space="preserve"> </w:t>
+      </w:r>
+    </w:p>
+    <w:p>
+      <w:pPr>
+        <w:numPr>
+          <w:ilvl w:val="0"/>
+          <w:numId w:val="5"/>
+        </w:numPr>
+      </w:pPr>
+      <w:r>
+        <w:t>What line is the error on?</w:t>
+      </w:r>
+    </w:p>
+    <w:p>
+      <w:pPr>
+        <w:ind w:left="720"/>
+      </w:pPr>
+      <w:r>
+        <w:t>Line 1 char 24</w:t>
+      </w:r>
+    </w:p>
+    <w:p>
+      <w:pPr>
+        <w:numPr>
+          <w:ilvl w:val="0"/>
+          <w:numId w:val="5"/>
+        </w:numPr>
+      </w:pPr>
+      <w:r>
+        <w:t>How would you fix it?</w:t>
+      </w:r>
+    </w:p>
+    <w:p>
+      <w:pPr>
+        <w:ind w:left="720"/>
+      </w:pPr>
+      <w:r>
+        <w:t>Correct the spelling of Id</w:t>
+      </w:r>
+    </w:p>
+    <w:p>
+      <w:pPr>
+        <w:ind w:left="720"/>
+      </w:pPr>
+    </w:p>
+    <w:p>
+      <w:pPr>
+        <w:tabs>
+          <w:tab w:val="num" w:pos="720"/>
+        </w:tabs>
+        <w:ind w:left="720" w:hanging="360"/>
+        <w:rPr>
+          <w:b/>
+          <w:bCs/>
+        </w:rPr>
+      </w:pPr>
+      <w:r>
+        <w:rPr>
+          <w:b/>
+          <w:bCs/>
+        </w:rPr>
+        <w:t xml:space="preserve">ERROR </w:t>
+      </w:r>
+      <w:r>
+        <w:rPr>
+          <w:b/>
+          <w:bCs/>
+        </w:rPr>
+        <w:t>E</w:t>
+      </w:r>
+    </w:p>
+    <w:p>
+      <w:pPr>
+        <w:ind w:left="360"/>
+      </w:pPr>
+      <w:r>
+        <w:t>1</w:t>
+      </w:r>
+      <w:r>
+        <w:t>.</w:t>
+      </w:r>
+      <w:r>
+        <w:t>What TYPE of error is it?</w:t>
+      </w:r>
+    </w:p>
+    <w:p>
+      <w:pPr>
+        <w:ind w:left="720"/>
+      </w:pPr>
+      <w:r>
+        <w:t>Syntax Error</w:t>
+      </w:r>
+    </w:p>
+    <w:p>
+      <w:pPr>
+        <w:ind w:left="360"/>
+      </w:pPr>
+      <w:r>
+        <w:t>2.</w:t>
+      </w:r>
+      <w:r>
+        <w:t>What does the message mean in plain English?</w:t>
+      </w:r>
+    </w:p>
+    <w:p>
+      <w:pPr>
+        <w:ind w:left="720"/>
+      </w:pPr>
+      <w:r>
+        <w:t>Unterminated string literal.- basically the string doesn’t have an opening or closing quote</w:t>
+      </w:r>
+    </w:p>
+    <w:p>
+      <w:pPr>
+        <w:ind w:left="360"/>
+      </w:pPr>
+      <w:r>
+        <w:t>3.</w:t>
+      </w:r>
+      <w:r>
+        <w:t>What line is the error on?</w:t>
+      </w:r>
+    </w:p>
+    <w:p>
+      <w:pPr>
+        <w:ind w:left="720"/>
+      </w:pPr>
+      <w:r>
+        <w:lastRenderedPageBreak/>
+        <w:t xml:space="preserve">Line 1 char </w:t>
+      </w:r>
+      <w:r>
+        <w:t>20</w:t>
+      </w:r>
+    </w:p>
+    <w:p>
+      <w:pPr>
+        <w:ind w:left="360"/>
+      </w:pPr>
+      <w:r>
+        <w:t>4.</w:t>
+      </w:r>
+      <w:r>
+        <w:t>How would you fix it?</w:t>
+      </w:r>
+    </w:p>
+    <w:p>
+      <w:pPr>
+        <w:ind w:left="720"/>
+      </w:pPr>
+      <w:r>
+        <w:t>Add the closing quote</w:t>
+      </w:r>
+    </w:p>
+    <w:p>
+      <w:pPr>
+        <w:tabs>
+          <w:tab w:val="num" w:pos="720"/>
+        </w:tabs>
+        <w:ind w:left="720" w:hanging="360"/>
+        <w:rPr>
+          <w:b/>
+          <w:bCs/>
+        </w:rPr>
+      </w:pPr>
+    </w:p>
+    <w:p>
+      <w:r>
+        <w:t xml:space="preserve">  </w:t>
+      </w:r>
+    </w:p>
     <w:p/>
     <w:sectPr>
       <w:pgSz w:w="12240" w:h="15840"/>
@@ -11,6 +582,591 @@
     </w:sectPr>
   </w:body>
 </w:document>
+</file>
+
+<file path=word/numbering.xml><?xml version="1.0" encoding="utf-8"?>
+<w:numbering xmlns:wpc="http://schemas.microsoft.com/office/word/2010/wordprocessingCanvas" xmlns:cx="http://schemas.microsoft.com/office/drawing/2014/chartex" xmlns:cx1="http://schemas.microsoft.com/office/drawing/2015/9/8/chartex" xmlns:cx2="http://schemas.microsoft.com/office/drawing/2015/10/21/chartex" xmlns:cx3="http://schemas.microsoft.com/office/drawing/2016/5/9/chartex" xmlns:cx4="http://schemas.microsoft.com/office/drawing/2016/5/10/chartex" xmlns:cx5="http://schemas.microsoft.com/office/drawing/2016/5/11/chartex" xmlns:cx6="http://schemas.microsoft.com/office/drawing/2016/5/12/chartex" xmlns:cx7="http://schemas.microsoft.com/office/drawing/2016/5/13/chartex" xmlns:cx8="http://schemas.microsoft.com/office/drawing/2016/5/14/chartex" xmlns:mc="http://schemas.openxmlformats.org/markup-compatibility/2006" xmlns:aink="http://schemas.microsoft.com/office/drawing/2016/ink" xmlns:am3d="http://schemas.microsoft.com/office/drawing/2017/model3d" xmlns:o="urn:schemas-microsoft-com:office:office" xmlns:oel="http://schemas.microsoft.com/office/2019/extlst" xmlns:r="http://schemas.openxmlformats.org/officeDocument/2006/relationships" xmlns:m="http://schemas.openxmlformats.org/officeDocument/2006/math" xmlns:v="urn:schemas-microsoft-com:vml" xmlns:wp14="http://schemas.microsoft.com/office/word/2010/wordprocessingDrawing" xmlns:wp="http://schemas.openxmlformats.org/drawingml/2006/wordprocessingDrawing" xmlns:w10="urn:schemas-microsoft-com:office:word" xmlns:w="http://schemas.openxmlformats.org/wordprocessingml/2006/main" xmlns:w14="http://schemas.microsoft.com/office/word/2010/wordml" xmlns:w15="http://schemas.microsoft.com/office/word/2012/wordml" xmlns:w16cex="http://schemas.microsoft.com/office/word/2018/wordml/cex" xmlns:w16cid="http://schemas.microsoft.com/office/word/2016/wordml/cid" xmlns:w16="http://schemas.microsoft.com/office/word/2018/wordml" xmlns:w16du="http://schemas.microsoft.com/office/word/2023/wordml/word16du" xmlns:w16sdtdh="http://schemas.microsoft.com/office/word/2020/wordml/sdtdatahash" xmlns:w16sdtfl="http://schemas.microsoft.com/office/word/2024/wordml/sdtformatlock" xmlns:w16se="http://schemas.microsoft.com/office/word/2015/wordml/symex" xmlns:wpg="http://schemas.microsoft.com/office/word/2010/wordprocessingGroup" xmlns:wpi="http://schemas.microsoft.com/office/word/2010/wordprocessingInk" xmlns:wne="http://schemas.microsoft.com/office/word/2006/wordml" xmlns:wps="http://schemas.microsoft.com/office/word/2010/wordprocessingShape" mc:Ignorable="w14 w15 w16se w16cid w16 w16cex w16sdtdh w16sdtfl w16du wp14">
+  <w:abstractNum w:abstractNumId="0" w15:restartNumberingAfterBreak="0">
+    <w:nsid w:val="004B68A7"/>
+    <w:multiLevelType w:val="multilevel"/>
+    <w:tmpl w:val="5746A71C"/>
+    <w:lvl w:ilvl="0">
+      <w:start w:val="1"/>
+      <w:numFmt w:val="decimal"/>
+      <w:lvlText w:val="%1."/>
+      <w:lvlJc w:val="left"/>
+      <w:pPr>
+        <w:tabs>
+          <w:tab w:val="num" w:pos="720"/>
+        </w:tabs>
+        <w:ind w:left="720" w:hanging="360"/>
+      </w:pPr>
+    </w:lvl>
+    <w:lvl w:ilvl="1" w:tentative="1">
+      <w:start w:val="1"/>
+      <w:numFmt w:val="decimal"/>
+      <w:lvlText w:val="%2."/>
+      <w:lvlJc w:val="left"/>
+      <w:pPr>
+        <w:tabs>
+          <w:tab w:val="num" w:pos="1440"/>
+        </w:tabs>
+        <w:ind w:left="1440" w:hanging="360"/>
+      </w:pPr>
+    </w:lvl>
+    <w:lvl w:ilvl="2" w:tentative="1">
+      <w:start w:val="1"/>
+      <w:numFmt w:val="decimal"/>
+      <w:lvlText w:val="%3."/>
+      <w:lvlJc w:val="left"/>
+      <w:pPr>
+        <w:tabs>
+          <w:tab w:val="num" w:pos="2160"/>
+        </w:tabs>
+        <w:ind w:left="2160" w:hanging="360"/>
+      </w:pPr>
+    </w:lvl>
+    <w:lvl w:ilvl="3" w:tentative="1">
+      <w:start w:val="1"/>
+      <w:numFmt w:val="decimal"/>
+      <w:lvlText w:val="%4."/>
+      <w:lvlJc w:val="left"/>
+      <w:pPr>
+        <w:tabs>
+          <w:tab w:val="num" w:pos="2880"/>
+        </w:tabs>
+        <w:ind w:left="2880" w:hanging="360"/>
+      </w:pPr>
+    </w:lvl>
+    <w:lvl w:ilvl="4" w:tentative="1">
+      <w:start w:val="1"/>
+      <w:numFmt w:val="decimal"/>
+      <w:lvlText w:val="%5."/>
+      <w:lvlJc w:val="left"/>
+      <w:pPr>
+        <w:tabs>
+          <w:tab w:val="num" w:pos="3600"/>
+        </w:tabs>
+        <w:ind w:left="3600" w:hanging="360"/>
+      </w:pPr>
+    </w:lvl>
+    <w:lvl w:ilvl="5" w:tentative="1">
+      <w:start w:val="1"/>
+      <w:numFmt w:val="decimal"/>
+      <w:lvlText w:val="%6."/>
+      <w:lvlJc w:val="left"/>
+      <w:pPr>
+        <w:tabs>
+          <w:tab w:val="num" w:pos="4320"/>
+        </w:tabs>
+        <w:ind w:left="4320" w:hanging="360"/>
+      </w:pPr>
+    </w:lvl>
+    <w:lvl w:ilvl="6" w:tentative="1">
+      <w:start w:val="1"/>
+      <w:numFmt w:val="decimal"/>
+      <w:lvlText w:val="%7."/>
+      <w:lvlJc w:val="left"/>
+      <w:pPr>
+        <w:tabs>
+          <w:tab w:val="num" w:pos="5040"/>
+        </w:tabs>
+        <w:ind w:left="5040" w:hanging="360"/>
+      </w:pPr>
+    </w:lvl>
+    <w:lvl w:ilvl="7" w:tentative="1">
+      <w:start w:val="1"/>
+      <w:numFmt w:val="decimal"/>
+      <w:lvlText w:val="%8."/>
+      <w:lvlJc w:val="left"/>
+      <w:pPr>
+        <w:tabs>
+          <w:tab w:val="num" w:pos="5760"/>
+        </w:tabs>
+        <w:ind w:left="5760" w:hanging="360"/>
+      </w:pPr>
+    </w:lvl>
+    <w:lvl w:ilvl="8" w:tentative="1">
+      <w:start w:val="1"/>
+      <w:numFmt w:val="decimal"/>
+      <w:lvlText w:val="%9."/>
+      <w:lvlJc w:val="left"/>
+      <w:pPr>
+        <w:tabs>
+          <w:tab w:val="num" w:pos="6480"/>
+        </w:tabs>
+        <w:ind w:left="6480" w:hanging="360"/>
+      </w:pPr>
+    </w:lvl>
+  </w:abstractNum>
+  <w:abstractNum w:abstractNumId="1" w15:restartNumberingAfterBreak="0">
+    <w:nsid w:val="2684557D"/>
+    <w:multiLevelType w:val="multilevel"/>
+    <w:tmpl w:val="E1900070"/>
+    <w:lvl w:ilvl="0">
+      <w:start w:val="1"/>
+      <w:numFmt w:val="decimal"/>
+      <w:lvlText w:val="%1."/>
+      <w:lvlJc w:val="left"/>
+      <w:pPr>
+        <w:tabs>
+          <w:tab w:val="num" w:pos="720"/>
+        </w:tabs>
+        <w:ind w:left="720" w:hanging="360"/>
+      </w:pPr>
+    </w:lvl>
+    <w:lvl w:ilvl="1" w:tentative="1">
+      <w:start w:val="1"/>
+      <w:numFmt w:val="decimal"/>
+      <w:lvlText w:val="%2."/>
+      <w:lvlJc w:val="left"/>
+      <w:pPr>
+        <w:tabs>
+          <w:tab w:val="num" w:pos="1440"/>
+        </w:tabs>
+        <w:ind w:left="1440" w:hanging="360"/>
+      </w:pPr>
+    </w:lvl>
+    <w:lvl w:ilvl="2" w:tentative="1">
+      <w:start w:val="1"/>
+      <w:numFmt w:val="decimal"/>
+      <w:lvlText w:val="%3."/>
+      <w:lvlJc w:val="left"/>
+      <w:pPr>
+        <w:tabs>
+          <w:tab w:val="num" w:pos="2160"/>
+        </w:tabs>
+        <w:ind w:left="2160" w:hanging="360"/>
+      </w:pPr>
+    </w:lvl>
+    <w:lvl w:ilvl="3" w:tentative="1">
+      <w:start w:val="1"/>
+      <w:numFmt w:val="decimal"/>
+      <w:lvlText w:val="%4."/>
+      <w:lvlJc w:val="left"/>
+      <w:pPr>
+        <w:tabs>
+          <w:tab w:val="num" w:pos="2880"/>
+        </w:tabs>
+        <w:ind w:left="2880" w:hanging="360"/>
+      </w:pPr>
+    </w:lvl>
+    <w:lvl w:ilvl="4" w:tentative="1">
+      <w:start w:val="1"/>
+      <w:numFmt w:val="decimal"/>
+      <w:lvlText w:val="%5."/>
+      <w:lvlJc w:val="left"/>
+      <w:pPr>
+        <w:tabs>
+          <w:tab w:val="num" w:pos="3600"/>
+        </w:tabs>
+        <w:ind w:left="3600" w:hanging="360"/>
+      </w:pPr>
+    </w:lvl>
+    <w:lvl w:ilvl="5" w:tentative="1">
+      <w:start w:val="1"/>
+      <w:numFmt w:val="decimal"/>
+      <w:lvlText w:val="%6."/>
+      <w:lvlJc w:val="left"/>
+      <w:pPr>
+        <w:tabs>
+          <w:tab w:val="num" w:pos="4320"/>
+        </w:tabs>
+        <w:ind w:left="4320" w:hanging="360"/>
+      </w:pPr>
+    </w:lvl>
+    <w:lvl w:ilvl="6" w:tentative="1">
+      <w:start w:val="1"/>
+      <w:numFmt w:val="decimal"/>
+      <w:lvlText w:val="%7."/>
+      <w:lvlJc w:val="left"/>
+      <w:pPr>
+        <w:tabs>
+          <w:tab w:val="num" w:pos="5040"/>
+        </w:tabs>
+        <w:ind w:left="5040" w:hanging="360"/>
+      </w:pPr>
+    </w:lvl>
+    <w:lvl w:ilvl="7" w:tentative="1">
+      <w:start w:val="1"/>
+      <w:numFmt w:val="decimal"/>
+      <w:lvlText w:val="%8."/>
+      <w:lvlJc w:val="left"/>
+      <w:pPr>
+        <w:tabs>
+          <w:tab w:val="num" w:pos="5760"/>
+        </w:tabs>
+        <w:ind w:left="5760" w:hanging="360"/>
+      </w:pPr>
+    </w:lvl>
+    <w:lvl w:ilvl="8" w:tentative="1">
+      <w:start w:val="1"/>
+      <w:numFmt w:val="decimal"/>
+      <w:lvlText w:val="%9."/>
+      <w:lvlJc w:val="left"/>
+      <w:pPr>
+        <w:tabs>
+          <w:tab w:val="num" w:pos="6480"/>
+        </w:tabs>
+        <w:ind w:left="6480" w:hanging="360"/>
+      </w:pPr>
+    </w:lvl>
+  </w:abstractNum>
+  <w:abstractNum w:abstractNumId="2" w15:restartNumberingAfterBreak="0">
+    <w:nsid w:val="4B537CC1"/>
+    <w:multiLevelType w:val="multilevel"/>
+    <w:tmpl w:val="8964465E"/>
+    <w:lvl w:ilvl="0">
+      <w:start w:val="1"/>
+      <w:numFmt w:val="decimal"/>
+      <w:lvlText w:val="%1."/>
+      <w:lvlJc w:val="left"/>
+      <w:pPr>
+        <w:tabs>
+          <w:tab w:val="num" w:pos="720"/>
+        </w:tabs>
+        <w:ind w:left="720" w:hanging="360"/>
+      </w:pPr>
+    </w:lvl>
+    <w:lvl w:ilvl="1" w:tentative="1">
+      <w:start w:val="1"/>
+      <w:numFmt w:val="decimal"/>
+      <w:lvlText w:val="%2."/>
+      <w:lvlJc w:val="left"/>
+      <w:pPr>
+        <w:tabs>
+          <w:tab w:val="num" w:pos="1440"/>
+        </w:tabs>
+        <w:ind w:left="1440" w:hanging="360"/>
+      </w:pPr>
+    </w:lvl>
+    <w:lvl w:ilvl="2" w:tentative="1">
+      <w:start w:val="1"/>
+      <w:numFmt w:val="decimal"/>
+      <w:lvlText w:val="%3."/>
+      <w:lvlJc w:val="left"/>
+      <w:pPr>
+        <w:tabs>
+          <w:tab w:val="num" w:pos="2160"/>
+        </w:tabs>
+        <w:ind w:left="2160" w:hanging="360"/>
+      </w:pPr>
+    </w:lvl>
+    <w:lvl w:ilvl="3" w:tentative="1">
+      <w:start w:val="1"/>
+      <w:numFmt w:val="decimal"/>
+      <w:lvlText w:val="%4."/>
+      <w:lvlJc w:val="left"/>
+      <w:pPr>
+        <w:tabs>
+          <w:tab w:val="num" w:pos="2880"/>
+        </w:tabs>
+        <w:ind w:left="2880" w:hanging="360"/>
+      </w:pPr>
+    </w:lvl>
+    <w:lvl w:ilvl="4" w:tentative="1">
+      <w:start w:val="1"/>
+      <w:numFmt w:val="decimal"/>
+      <w:lvlText w:val="%5."/>
+      <w:lvlJc w:val="left"/>
+      <w:pPr>
+        <w:tabs>
+          <w:tab w:val="num" w:pos="3600"/>
+        </w:tabs>
+        <w:ind w:left="3600" w:hanging="360"/>
+      </w:pPr>
+    </w:lvl>
+    <w:lvl w:ilvl="5" w:tentative="1">
+      <w:start w:val="1"/>
+      <w:numFmt w:val="decimal"/>
+      <w:lvlText w:val="%6."/>
+      <w:lvlJc w:val="left"/>
+      <w:pPr>
+        <w:tabs>
+          <w:tab w:val="num" w:pos="4320"/>
+        </w:tabs>
+        <w:ind w:left="4320" w:hanging="360"/>
+      </w:pPr>
+    </w:lvl>
+    <w:lvl w:ilvl="6" w:tentative="1">
+      <w:start w:val="1"/>
+      <w:numFmt w:val="decimal"/>
+      <w:lvlText w:val="%7."/>
+      <w:lvlJc w:val="left"/>
+      <w:pPr>
+        <w:tabs>
+          <w:tab w:val="num" w:pos="5040"/>
+        </w:tabs>
+        <w:ind w:left="5040" w:hanging="360"/>
+      </w:pPr>
+    </w:lvl>
+    <w:lvl w:ilvl="7" w:tentative="1">
+      <w:start w:val="1"/>
+      <w:numFmt w:val="decimal"/>
+      <w:lvlText w:val="%8."/>
+      <w:lvlJc w:val="left"/>
+      <w:pPr>
+        <w:tabs>
+          <w:tab w:val="num" w:pos="5760"/>
+        </w:tabs>
+        <w:ind w:left="5760" w:hanging="360"/>
+      </w:pPr>
+    </w:lvl>
+    <w:lvl w:ilvl="8" w:tentative="1">
+      <w:start w:val="1"/>
+      <w:numFmt w:val="decimal"/>
+      <w:lvlText w:val="%9."/>
+      <w:lvlJc w:val="left"/>
+      <w:pPr>
+        <w:tabs>
+          <w:tab w:val="num" w:pos="6480"/>
+        </w:tabs>
+        <w:ind w:left="6480" w:hanging="360"/>
+      </w:pPr>
+    </w:lvl>
+  </w:abstractNum>
+  <w:abstractNum w:abstractNumId="3" w15:restartNumberingAfterBreak="0">
+    <w:nsid w:val="527E6D82"/>
+    <w:multiLevelType w:val="multilevel"/>
+    <w:tmpl w:val="6A060246"/>
+    <w:lvl w:ilvl="0">
+      <w:start w:val="1"/>
+      <w:numFmt w:val="decimal"/>
+      <w:lvlText w:val="%1."/>
+      <w:lvlJc w:val="left"/>
+      <w:pPr>
+        <w:tabs>
+          <w:tab w:val="num" w:pos="720"/>
+        </w:tabs>
+        <w:ind w:left="720" w:hanging="360"/>
+      </w:pPr>
+    </w:lvl>
+    <w:lvl w:ilvl="1" w:tentative="1">
+      <w:start w:val="1"/>
+      <w:numFmt w:val="decimal"/>
+      <w:lvlText w:val="%2."/>
+      <w:lvlJc w:val="left"/>
+      <w:pPr>
+        <w:tabs>
+          <w:tab w:val="num" w:pos="1440"/>
+        </w:tabs>
+        <w:ind w:left="1440" w:hanging="360"/>
+      </w:pPr>
+    </w:lvl>
+    <w:lvl w:ilvl="2" w:tentative="1">
+      <w:start w:val="1"/>
+      <w:numFmt w:val="decimal"/>
+      <w:lvlText w:val="%3."/>
+      <w:lvlJc w:val="left"/>
+      <w:pPr>
+        <w:tabs>
+          <w:tab w:val="num" w:pos="2160"/>
+        </w:tabs>
+        <w:ind w:left="2160" w:hanging="360"/>
+      </w:pPr>
+    </w:lvl>
+    <w:lvl w:ilvl="3" w:tentative="1">
+      <w:start w:val="1"/>
+      <w:numFmt w:val="decimal"/>
+      <w:lvlText w:val="%4."/>
+      <w:lvlJc w:val="left"/>
+      <w:pPr>
+        <w:tabs>
+          <w:tab w:val="num" w:pos="2880"/>
+        </w:tabs>
+        <w:ind w:left="2880" w:hanging="360"/>
+      </w:pPr>
+    </w:lvl>
+    <w:lvl w:ilvl="4" w:tentative="1">
+      <w:start w:val="1"/>
+      <w:numFmt w:val="decimal"/>
+      <w:lvlText w:val="%5."/>
+      <w:lvlJc w:val="left"/>
+      <w:pPr>
+        <w:tabs>
+          <w:tab w:val="num" w:pos="3600"/>
+        </w:tabs>
+        <w:ind w:left="3600" w:hanging="360"/>
+      </w:pPr>
+    </w:lvl>
+    <w:lvl w:ilvl="5" w:tentative="1">
+      <w:start w:val="1"/>
+      <w:numFmt w:val="decimal"/>
+      <w:lvlText w:val="%6."/>
+      <w:lvlJc w:val="left"/>
+      <w:pPr>
+        <w:tabs>
+          <w:tab w:val="num" w:pos="4320"/>
+        </w:tabs>
+        <w:ind w:left="4320" w:hanging="360"/>
+      </w:pPr>
+    </w:lvl>
+    <w:lvl w:ilvl="6" w:tentative="1">
+      <w:start w:val="1"/>
+      <w:numFmt w:val="decimal"/>
+      <w:lvlText w:val="%7."/>
+      <w:lvlJc w:val="left"/>
+      <w:pPr>
+        <w:tabs>
+          <w:tab w:val="num" w:pos="5040"/>
+        </w:tabs>
+        <w:ind w:left="5040" w:hanging="360"/>
+      </w:pPr>
+    </w:lvl>
+    <w:lvl w:ilvl="7" w:tentative="1">
+      <w:start w:val="1"/>
+      <w:numFmt w:val="decimal"/>
+      <w:lvlText w:val="%8."/>
+      <w:lvlJc w:val="left"/>
+      <w:pPr>
+        <w:tabs>
+          <w:tab w:val="num" w:pos="5760"/>
+        </w:tabs>
+        <w:ind w:left="5760" w:hanging="360"/>
+      </w:pPr>
+    </w:lvl>
+    <w:lvl w:ilvl="8" w:tentative="1">
+      <w:start w:val="1"/>
+      <w:numFmt w:val="decimal"/>
+      <w:lvlText w:val="%9."/>
+      <w:lvlJc w:val="left"/>
+      <w:pPr>
+        <w:tabs>
+          <w:tab w:val="num" w:pos="6480"/>
+        </w:tabs>
+        <w:ind w:left="6480" w:hanging="360"/>
+      </w:pPr>
+    </w:lvl>
+  </w:abstractNum>
+  <w:abstractNum w:abstractNumId="4" w15:restartNumberingAfterBreak="0">
+    <w:nsid w:val="74A11D79"/>
+    <w:multiLevelType w:val="multilevel"/>
+    <w:tmpl w:val="CA7C9108"/>
+    <w:lvl w:ilvl="0">
+      <w:start w:val="1"/>
+      <w:numFmt w:val="decimal"/>
+      <w:lvlText w:val="%1."/>
+      <w:lvlJc w:val="left"/>
+      <w:pPr>
+        <w:tabs>
+          <w:tab w:val="num" w:pos="720"/>
+        </w:tabs>
+        <w:ind w:left="720" w:hanging="360"/>
+      </w:pPr>
+    </w:lvl>
+    <w:lvl w:ilvl="1" w:tentative="1">
+      <w:start w:val="1"/>
+      <w:numFmt w:val="decimal"/>
+      <w:lvlText w:val="%2."/>
+      <w:lvlJc w:val="left"/>
+      <w:pPr>
+        <w:tabs>
+          <w:tab w:val="num" w:pos="1440"/>
+        </w:tabs>
+        <w:ind w:left="1440" w:hanging="360"/>
+      </w:pPr>
+    </w:lvl>
+    <w:lvl w:ilvl="2" w:tentative="1">
+      <w:start w:val="1"/>
+      <w:numFmt w:val="decimal"/>
+      <w:lvlText w:val="%3."/>
+      <w:lvlJc w:val="left"/>
+      <w:pPr>
+        <w:tabs>
+          <w:tab w:val="num" w:pos="2160"/>
+        </w:tabs>
+        <w:ind w:left="2160" w:hanging="360"/>
+      </w:pPr>
+    </w:lvl>
+    <w:lvl w:ilvl="3" w:tentative="1">
+      <w:start w:val="1"/>
+      <w:numFmt w:val="decimal"/>
+      <w:lvlText w:val="%4."/>
+      <w:lvlJc w:val="left"/>
+      <w:pPr>
+        <w:tabs>
+          <w:tab w:val="num" w:pos="2880"/>
+        </w:tabs>
+        <w:ind w:left="2880" w:hanging="360"/>
+      </w:pPr>
+    </w:lvl>
+    <w:lvl w:ilvl="4" w:tentative="1">
+      <w:start w:val="1"/>
+      <w:numFmt w:val="decimal"/>
+      <w:lvlText w:val="%5."/>
+      <w:lvlJc w:val="left"/>
+      <w:pPr>
+        <w:tabs>
+          <w:tab w:val="num" w:pos="3600"/>
+        </w:tabs>
+        <w:ind w:left="3600" w:hanging="360"/>
+      </w:pPr>
+    </w:lvl>
+    <w:lvl w:ilvl="5" w:tentative="1">
+      <w:start w:val="1"/>
+      <w:numFmt w:val="decimal"/>
+      <w:lvlText w:val="%6."/>
+      <w:lvlJc w:val="left"/>
+      <w:pPr>
+        <w:tabs>
+          <w:tab w:val="num" w:pos="4320"/>
+        </w:tabs>
+        <w:ind w:left="4320" w:hanging="360"/>
+      </w:pPr>
+    </w:lvl>
+    <w:lvl w:ilvl="6" w:tentative="1">
+      <w:start w:val="1"/>
+      <w:numFmt w:val="decimal"/>
+      <w:lvlText w:val="%7."/>
+      <w:lvlJc w:val="left"/>
+      <w:pPr>
+        <w:tabs>
+          <w:tab w:val="num" w:pos="5040"/>
+        </w:tabs>
+        <w:ind w:left="5040" w:hanging="360"/>
+      </w:pPr>
+    </w:lvl>
+    <w:lvl w:ilvl="7" w:tentative="1">
+      <w:start w:val="1"/>
+      <w:numFmt w:val="decimal"/>
+      <w:lvlText w:val="%8."/>
+      <w:lvlJc w:val="left"/>
+      <w:pPr>
+        <w:tabs>
+          <w:tab w:val="num" w:pos="5760"/>
+        </w:tabs>
+        <w:ind w:left="5760" w:hanging="360"/>
+      </w:pPr>
+    </w:lvl>
+    <w:lvl w:ilvl="8" w:tentative="1">
+      <w:start w:val="1"/>
+      <w:numFmt w:val="decimal"/>
+      <w:lvlText w:val="%9."/>
+      <w:lvlJc w:val="left"/>
+      <w:pPr>
+        <w:tabs>
+          <w:tab w:val="num" w:pos="6480"/>
+        </w:tabs>
+        <w:ind w:left="6480" w:hanging="360"/>
+      </w:pPr>
+    </w:lvl>
+  </w:abstractNum>
+  <w:num w:numId="1" w16cid:durableId="1525097335">
+    <w:abstractNumId w:val="3"/>
+  </w:num>
+  <w:num w:numId="2" w16cid:durableId="1186791465">
+    <w:abstractNumId w:val="4"/>
+  </w:num>
+  <w:num w:numId="3" w16cid:durableId="76824858">
+    <w:abstractNumId w:val="1"/>
+  </w:num>
+  <w:num w:numId="4" w16cid:durableId="1942955516">
+    <w:abstractNumId w:val="2"/>
+  </w:num>
+  <w:num w:numId="5" w16cid:durableId="1050033638">
+    <w:abstractNumId w:val="0"/>
+  </w:num>
+</w:numbering>
 </file>
 
 <file path=word/styles.xml><?xml version="1.0" encoding="utf-8"?>
@@ -413,6 +1569,7 @@
   <w:style w:type="paragraph" w:default="1" w:styleId="Normal">
     <w:name w:val="Normal"/>
     <w:qFormat/>
+    <w:rsid w:val="00E11A7D"/>
   </w:style>
   <w:style w:type="paragraph" w:styleId="Heading1">
     <w:name w:val="heading 1"/>
@@ -616,7 +1773,6 @@
   <w:style w:type="character" w:default="1" w:styleId="DefaultParagraphFont">
     <w:name w:val="Default Paragraph Font"/>
     <w:uiPriority w:val="1"/>
-    <w:semiHidden/>
     <w:unhideWhenUsed/>
   </w:style>
   <w:style w:type="table" w:default="1" w:styleId="TableNormal">

</xml_diff>